<commit_message>
figures: strip fig5 to read/write boundaries only
The multistart scatter and the black cell V_T0 contour both sat on top of
the mode boundaries, so the plot carried three lines saying nearly the same
thing. The diverging fill is already pinned at V_T0, so pass/fail reads off
the colour change without a contour drawn over it.

Legend is now read/write V_T0 boundary only; the "(axis-wise exact)"
qualifier is gone from the legend and from the fig5 captions in every paper
variant and in make_docx.js. Captions and their referring sentences updated
to match what the figure shows; docx rebuilt (en, kr); LEDGER F005 row
follows.

Co-Authored-By: Claude Opus 5 <noreply@anthropic.com>
Claude-Session: https://claude.ai/code/session_0146jNHtLuMZdJBfHXrfdtk8
</commit_message>
<xml_diff>
--- a/manuscript/SRAM_Vmin_IEEE.docx
+++ b/manuscript/SRAM_Vmin_IEEE.docx
@@ -3642,7 +3642,7 @@
           <w:sz w:val="16"/>
           <w:szCs w:val="16"/>
         </w:rPr>
-        <w:t xml:space="preserve">  V</w:t>
+        <w:t xml:space="preserve">  Cell V</w:t>
       </w:r>
       <w:r>
         <w:rPr>
@@ -3659,7 +3659,7 @@
           <w:sz w:val="16"/>
           <w:szCs w:val="16"/>
         </w:rPr>
-        <w:t xml:space="preserve"> contours over the (ΔV</w:t>
+        <w:t xml:space="preserve"> = max(read, write) over the (ΔV</w:t>
       </w:r>
       <w:r>
         <w:rPr>
@@ -3693,7 +3693,24 @@
           <w:sz w:val="16"/>
           <w:szCs w:val="16"/>
         </w:rPr>
-        <w:t xml:space="preserve">) plane with the specification boundary recovered by axis-wise inverse query.</w:t>
+        <w:t xml:space="preserve">) plane, with each mode's V</w:t>
+      </w:r>
+      <w:r>
+        <w:rPr>
+          <w:rFonts w:ascii="Times New Roman" w:cs="Times New Roman" w:eastAsia="Times New Roman" w:hAnsi="Times New Roman"/>
+          <w:sz w:val="16"/>
+          <w:szCs w:val="16"/>
+          <w:vertAlign w:val="subscript"/>
+        </w:rPr>
+        <w:t xml:space="preserve">T0</w:t>
+      </w:r>
+      <w:r>
+        <w:rPr>
+          <w:rFonts w:ascii="Times New Roman" w:cs="Times New Roman" w:eastAsia="Times New Roman" w:hAnsi="Times New Roman"/>
+          <w:sz w:val="16"/>
+          <w:szCs w:val="16"/>
+        </w:rPr>
+        <w:t xml:space="preserve"> boundary.</w:t>
       </w:r>
     </w:p>
     <w:p>

</xml_diff>